<commit_message>
List full author names for Grosse, Li, and Shi references (MISQ version)
Authors taken from the arXiv abstract pages (2308.03296, 2403.03218, 2407.06460).

Co-Authored-By: Claude Sonnet 5.5 <noreply@anthropic.com>
Claude-Session: https://claude.ai/code/session_011RffuMUjsLZvDoxDjbpt5j
</commit_message>
<xml_diff>
--- a/pricing_forgetting/Pricing_Forgetting_MISQ_submission.docx
+++ b/pricing_forgetting/Pricing_Forgetting_MISQ_submission.docx
@@ -2293,7 +2293,7 @@
         <w:pStyle w:val="Reference"/>
       </w:pPr>
       <w:r>
-        <w:t xml:space="preserve">Grosse, R., et al. 2023. "Studying Large Language Model Generalization with Influence Functions," </w:t>
+        <w:t xml:space="preserve">Grosse, R., Bae, J., Anil, C., Elhage, N., Tamkin, A., Tajdini, A., Steiner, B., Li, D., Durmus, E., Perez, E., Hubinger, E., Lukošiūtė, K., Nguyen, K., Joseph, N., McCandlish, S., Kaplan, J., and Bowman, S. R. 2023. "Studying Large Language Model Generalization with Influence Functions," </w:t>
       </w:r>
       <w:r>
         <w:t xml:space="preserve">arXiv:2308.03296.</w:t>
@@ -2372,7 +2372,7 @@
         <w:pStyle w:val="Reference"/>
       </w:pPr>
       <w:r>
-        <w:t xml:space="preserve">Li, N., et al. 2024. "The WMDP Benchmark: Measuring and Reducing Malicious Use with Unlearning," in </w:t>
+        <w:t xml:space="preserve">Li, N., Pan, A., Gopal, A., Yue, S., Berrios, D., Gatti, A., Li, J. D., Dombrowski, A.-K., Goel, S., Phan, L., Mukobi, G., Helm-Burger, N., Lababidi, R., Justen, L., Liu, A. B., Chen, M., Barrass, I., Zhang, O., Zhu, X., Tamirisa, R., Bharathi, B., Khoja, A., Zhao, Z., Herbert-Voss, A., Breuer, C. B., Marks, S., Patel, O., Zou, A., Mazeika, M., Wang, Z., Oswal, P., Lin, W., Hunt, A. A., Tienken-Harder, J., Shih, K. Y., Talley, K., Guan, J., Kaplan, R., Steneker, I., Campbell, D., Jokubaitis, B., Levinson, A., Wang, J., Qian, W., Karmakar, K. K., Basart, S., Fitz, S., Levine, M., Kumaraguru, P., Tupakula, U., Varadharajan, V., Wang, R., Shoshitaishvili, Y., Ba, J., Esvelt, K. M., Wang, A., and Hendrycks, D. 2024. "The WMDP Benchmark: Measuring and Reducing Malicious Use with Unlearning," in </w:t>
       </w:r>
       <w:r>
         <w:rPr>
@@ -2473,7 +2473,7 @@
         <w:pStyle w:val="Reference"/>
       </w:pPr>
       <w:r>
-        <w:t xml:space="preserve">Shi, W., et al. 2024. "MUSE: Machine Unlearning Six-Way Evaluation for Language Models," </w:t>
+        <w:t xml:space="preserve">Shi, W., Lee, J., Huang, Y., Malladi, S., Zhao, J., Holtzman, A., Liu, D., Zettlemoyer, L., Smith, N. A., and Zhang, C. 2024. "MUSE: Machine Unlearning Six-Way Evaluation for Language Models," </w:t>
       </w:r>
       <w:r>
         <w:t xml:space="preserve">arXiv:2407.06460.</w:t>

</xml_diff>

<commit_message>
Add pages and proceedings details to conference references; use ICML author list for WMDP
Page ranges and PMLR volumes from the PMLR pages, Crossref (EC 2019), NeurIPS
and IEEE S&P records. WMDP is cited as the ICML 2024 paper, so its author list
now follows the proceedings (46 authors) rather than the arXiv revision.
Pruthi et al. (NeurIPS 2020) pages are left out because they could not be verified.

Co-Authored-By: Claude Sonnet 5.5 <noreply@anthropic.com>
Claude-Session: https://claude.ai/code/session_011RffuMUjsLZvDoxDjbpt5j
</commit_message>
<xml_diff>
--- a/pricing_forgetting/Pricing_Forgetting_MISQ_submission.docx
+++ b/pricing_forgetting/Pricing_Forgetting_MISQ_submission.docx
@@ -2189,6 +2189,248 @@
         <w:t xml:space="preserve">Proceedings of the 2019 ACM Conference on Economics and Computation (EC)</w:t>
       </w:r>
       <w:r>
+        <w:t xml:space="preserve">, pp. 701-726.</w:t>
+      </w:r>
+    </w:p>
+    <w:p>
+      <w:pPr>
+        <w:pStyle w:val="Reference"/>
+      </w:pPr>
+      <w:r>
+        <w:t xml:space="preserve">Bourtoule, L., Chandrasekaran, V., Choquette-Choo, C. A., Jia, H., Travers, A., Zhang, B., Lie, D., and Papernot, N. 2021. "Machine Unlearning," in </w:t>
+      </w:r>
+      <w:r>
+        <w:rPr>
+          <w:i/>
+        </w:rPr>
+        <w:t xml:space="preserve">Proceedings of the 2021 IEEE Symposium on Security and Privacy</w:t>
+      </w:r>
+      <w:r>
+        <w:t xml:space="preserve">, pp. 141-159.</w:t>
+      </w:r>
+    </w:p>
+    <w:p>
+      <w:pPr>
+        <w:pStyle w:val="Reference"/>
+      </w:pPr>
+      <w:r>
+        <w:t xml:space="preserve">Calabresi, G., and Melamed, A. D. 1972. "Property Rules, Liability Rules, and Inalienability: One View of the Cathedral," </w:t>
+      </w:r>
+      <w:r>
+        <w:rPr>
+          <w:i/>
+        </w:rPr>
+        <w:t xml:space="preserve">Harvard Law Review</w:t>
+      </w:r>
+      <w:r>
+        <w:t xml:space="preserve"> (85:6), pp. 1089-1128.</w:t>
+      </w:r>
+    </w:p>
+    <w:p>
+      <w:pPr>
+        <w:pStyle w:val="Reference"/>
+      </w:pPr>
+      <w:r>
+        <w:t xml:space="preserve">Cao, Y., and Yang, J. 2015. "Towards Making Systems Forget with Machine Unlearning," in </w:t>
+      </w:r>
+      <w:r>
+        <w:rPr>
+          <w:i/>
+        </w:rPr>
+        <w:t xml:space="preserve">Proceedings of the 2015 IEEE Symposium on Security and Privacy</w:t>
+      </w:r>
+      <w:r>
+        <w:t xml:space="preserve">, pp. 463-480.</w:t>
+      </w:r>
+    </w:p>
+    <w:p>
+      <w:pPr>
+        <w:pStyle w:val="Reference"/>
+      </w:pPr>
+      <w:r>
+        <w:t xml:space="preserve">Eldan, R., and Russinovich, M. 2023. "Who's Harry Potter? Approximate Unlearning in LLMs," </w:t>
+      </w:r>
+      <w:r>
+        <w:t xml:space="preserve">arXiv:2310.02238.</w:t>
+      </w:r>
+    </w:p>
+    <w:p>
+      <w:pPr>
+        <w:pStyle w:val="Reference"/>
+      </w:pPr>
+      <w:r>
+        <w:t xml:space="preserve">Ghorbani, A., and Zou, J. 2019. "Data Shapley: Equitable Valuation of Data for Machine Learning," in </w:t>
+      </w:r>
+      <w:r>
+        <w:rPr>
+          <w:i/>
+        </w:rPr>
+        <w:t xml:space="preserve">Proceedings of the 36th International Conference on Machine Learning (ICML)</w:t>
+      </w:r>
+      <w:r>
+        <w:t xml:space="preserve">, PMLR 97, pp. 2242-2251.</w:t>
+      </w:r>
+    </w:p>
+    <w:p>
+      <w:pPr>
+        <w:pStyle w:val="Reference"/>
+      </w:pPr>
+      <w:r>
+        <w:t xml:space="preserve">Ginart, A., Guan, M., Valiant, G., and Zou, J. 2019. "Making AI Forget You: Data Deletion in Machine Learning," in </w:t>
+      </w:r>
+      <w:r>
+        <w:rPr>
+          <w:i/>
+        </w:rPr>
+        <w:t xml:space="preserve">Advances in Neural Information Processing Systems 32 (NeurIPS)</w:t>
+      </w:r>
+      <w:r>
+        <w:t xml:space="preserve">, pp. 3518-3531.</w:t>
+      </w:r>
+    </w:p>
+    <w:p>
+      <w:pPr>
+        <w:pStyle w:val="Reference"/>
+      </w:pPr>
+      <w:r>
+        <w:t xml:space="preserve">Grosse, R., Bae, J., Anil, C., Elhage, N., Tamkin, A., Tajdini, A., Steiner, B., Li, D., Durmus, E., Perez, E., Hubinger, E., Lukošiūtė, K., Nguyen, K., Joseph, N., McCandlish, S., Kaplan, J., and Bowman, S. R. 2023. "Studying Large Language Model Generalization with Influence Functions," </w:t>
+      </w:r>
+      <w:r>
+        <w:t xml:space="preserve">arXiv:2308.03296.</w:t>
+      </w:r>
+    </w:p>
+    <w:p>
+      <w:pPr>
+        <w:pStyle w:val="Reference"/>
+      </w:pPr>
+      <w:r>
+        <w:t xml:space="preserve">Jia, R., Dao, D., Wang, B., Hubis, F. A., Hynes, N., Gürel, N. M., Li, B., Zhang, C., Song, D., and Spanos, C. J. 2019. "Towards Efficient Data Valuation Based on the Shapley Value," in </w:t>
+      </w:r>
+      <w:r>
+        <w:rPr>
+          <w:i/>
+        </w:rPr>
+        <w:t xml:space="preserve">Proceedings of the 22nd International Conference on Artificial Intelligence and Statistics (AISTATS)</w:t>
+      </w:r>
+      <w:r>
+        <w:t xml:space="preserve">, PMLR 89, pp. 1167-1176.</w:t>
+      </w:r>
+    </w:p>
+    <w:p>
+      <w:pPr>
+        <w:pStyle w:val="Reference"/>
+      </w:pPr>
+      <w:r>
+        <w:t xml:space="preserve">Jones, C. I., and Tonetti, C. 2020. "Nonrivalry and the Economics of Data," </w:t>
+      </w:r>
+      <w:r>
+        <w:rPr>
+          <w:i/>
+        </w:rPr>
+        <w:t xml:space="preserve">American Economic Review</w:t>
+      </w:r>
+      <w:r>
+        <w:t xml:space="preserve"> (110:9), pp. 2819-2858.</w:t>
+      </w:r>
+    </w:p>
+    <w:p>
+      <w:pPr>
+        <w:pStyle w:val="Reference"/>
+      </w:pPr>
+      <w:r>
+        <w:t xml:space="preserve">Koh, P. W., and Liang, P. 2017. "Understanding Black-Box Predictions via Influence Functions," in </w:t>
+      </w:r>
+      <w:r>
+        <w:rPr>
+          <w:i/>
+        </w:rPr>
+        <w:t xml:space="preserve">Proceedings of the 34th International Conference on Machine Learning (ICML)</w:t>
+      </w:r>
+      <w:r>
+        <w:t xml:space="preserve">, PMLR 70, pp. 1885-1894.</w:t>
+      </w:r>
+    </w:p>
+    <w:p>
+      <w:pPr>
+        <w:pStyle w:val="Reference"/>
+      </w:pPr>
+      <w:r>
+        <w:t xml:space="preserve">Kwon, Y., and Zou, J. 2022. "Beta Shapley: A Unified and Noise-Reduced Data Valuation Framework for Machine Learning," in </w:t>
+      </w:r>
+      <w:r>
+        <w:rPr>
+          <w:i/>
+        </w:rPr>
+        <w:t xml:space="preserve">Proceedings of the 25th International Conference on Artificial Intelligence and Statistics (AISTATS)</w:t>
+      </w:r>
+      <w:r>
+        <w:t xml:space="preserve">, PMLR 151, pp. 8780-8802.</w:t>
+      </w:r>
+    </w:p>
+    <w:p>
+      <w:pPr>
+        <w:pStyle w:val="Reference"/>
+      </w:pPr>
+      <w:r>
+        <w:t xml:space="preserve">Li, N., Pan, A., Gopal, A., Yue, S., Berrios, D., Gatti, A., Li, J. D., Dombrowski, A.-K., Goel, S., Mukobi, G., Helm-Burger, N., Lababidi, R., Justen, L., Liu, A. B., Chen, M., Barrass, I., Zhang, O., Zhu, X., Tamirisa, R., Bharathi, B., Herbert-Voss, A., Breuer, C. B., Zou, A., Mazeika, M., Wang, Z., Oswal, P., Lin, W., Hunt, A. A., Tienken-Harder, J., Shih, K. Y., Talley, K., Guan, J., Steneker, I., Campbell, D., Jokubaitis, B., Basart, S., Fitz, S., Kumaraguru, P., Karmakar, K. K., Tupakula, U., Varadharajan, V., Shoshitaishvili, Y., Ba, J., Esvelt, K. M., Wang, A., and Hendrycks, D. 2024. "The WMDP Benchmark: Measuring and Reducing Malicious Use with Unlearning," in </w:t>
+      </w:r>
+      <w:r>
+        <w:rPr>
+          <w:i/>
+        </w:rPr>
+        <w:t xml:space="preserve">Proceedings of the 41st International Conference on Machine Learning (ICML)</w:t>
+      </w:r>
+      <w:r>
+        <w:t xml:space="preserve">, PMLR 235, pp. 28525-28550.</w:t>
+      </w:r>
+    </w:p>
+    <w:p>
+      <w:pPr>
+        <w:pStyle w:val="Reference"/>
+      </w:pPr>
+      <w:r>
+        <w:t xml:space="preserve">Łucki, J., Wei, B., Huang, Y., Henderson, P., Tramèr, F., and Rando, J. 2024. "An Adversarial Perspective on Machine Unlearning for AI Safety," </w:t>
+      </w:r>
+      <w:r>
+        <w:t xml:space="preserve">arXiv:2409.18025.</w:t>
+      </w:r>
+    </w:p>
+    <w:p>
+      <w:pPr>
+        <w:pStyle w:val="Reference"/>
+      </w:pPr>
+      <w:r>
+        <w:t xml:space="preserve">Lynch, A., Guo, P., Ewart, A., Casper, S., and Hadfield-Menell, D. 2024. "Eight Methods to Evaluate Robust Unlearning in LLMs," </w:t>
+      </w:r>
+      <w:r>
+        <w:t xml:space="preserve">arXiv:2402.16835.</w:t>
+      </w:r>
+    </w:p>
+    <w:p>
+      <w:pPr>
+        <w:pStyle w:val="Reference"/>
+      </w:pPr>
+      <w:r>
+        <w:t xml:space="preserve">Maini, P., Feng, Z., Schwarzschild, A., Lipton, Z. C., and Kolter, J. Z. 2024. "TOFU: A Task of Fictitious Unlearning for LLMs," </w:t>
+      </w:r>
+      <w:r>
+        <w:t xml:space="preserve">arXiv:2401.06121.</w:t>
+      </w:r>
+    </w:p>
+    <w:p>
+      <w:pPr>
+        <w:pStyle w:val="Reference"/>
+      </w:pPr>
+      <w:r>
+        <w:t xml:space="preserve">Pruthi, G., Liu, F., Kale, S., and Sundararajan, M. 2020. "Estimating Training Data Influence by Tracing Gradient Descent," in </w:t>
+      </w:r>
+      <w:r>
+        <w:rPr>
+          <w:i/>
+        </w:rPr>
+        <w:t xml:space="preserve">Advances in Neural Information Processing Systems 33 (NeurIPS)</w:t>
+      </w:r>
+      <w:r>
         <w:t xml:space="preserve">.</w:t>
       </w:r>
     </w:p>
@@ -2197,16 +2439,16 @@
         <w:pStyle w:val="Reference"/>
       </w:pPr>
       <w:r>
-        <w:t xml:space="preserve">Bourtoule, L., Chandrasekaran, V., Choquette-Choo, C. A., Jia, H., Travers, A., Zhang, B., Lie, D., and Papernot, N. 2021. "Machine Unlearning," in </w:t>
+        <w:t xml:space="preserve">Roth, A. E. (ed.). 1988. </w:t>
       </w:r>
       <w:r>
         <w:rPr>
           <w:i/>
         </w:rPr>
-        <w:t xml:space="preserve">Proceedings of the IEEE Symposium on Security and Privacy</w:t>
-      </w:r>
-      <w:r>
-        <w:t xml:space="preserve">.</w:t>
+        <w:t xml:space="preserve">The Shapley Value: Essays in Honor of Lloyd S. Shapley</w:t>
+      </w:r>
+      <w:r>
+        <w:t xml:space="preserve">, Cambridge, UK: Cambridge University Press.</w:t>
       </w:r>
     </w:p>
     <w:p>
@@ -2214,16 +2456,16 @@
         <w:pStyle w:val="Reference"/>
       </w:pPr>
       <w:r>
-        <w:t xml:space="preserve">Calabresi, G., and Melamed, A. D. 1972. "Property Rules, Liability Rules, and Inalienability: One View of the Cathedral," </w:t>
+        <w:t xml:space="preserve">Shapley, L. S. 1953. "A Value for n-Person Games," in </w:t>
       </w:r>
       <w:r>
         <w:rPr>
           <w:i/>
         </w:rPr>
-        <w:t xml:space="preserve">Harvard Law Review</w:t>
-      </w:r>
-      <w:r>
-        <w:t xml:space="preserve"> (85:6), pp. 1089-1128.</w:t>
+        <w:t xml:space="preserve">Contributions to the Theory of Games II</w:t>
+      </w:r>
+      <w:r>
+        <w:t xml:space="preserve">, H. W. Kuhn and A. W. Tucker (eds.), Princeton, NJ: Princeton University Press, pp. 307-317.</w:t>
       </w:r>
     </w:p>
     <w:p>
@@ -2231,269 +2473,27 @@
         <w:pStyle w:val="Reference"/>
       </w:pPr>
       <w:r>
-        <w:t xml:space="preserve">Cao, Y., and Yang, J. 2015. "Towards Making Systems Forget with Machine Unlearning," in </w:t>
+        <w:t xml:space="preserve">Shi, W., Lee, J., Huang, Y., Malladi, S., Zhao, J., Holtzman, A., Liu, D., Zettlemoyer, L., Smith, N. A., and Zhang, C. 2024. "MUSE: Machine Unlearning Six-Way Evaluation for Language Models," </w:t>
+      </w:r>
+      <w:r>
+        <w:t xml:space="preserve">arXiv:2407.06460.</w:t>
+      </w:r>
+    </w:p>
+    <w:p>
+      <w:pPr>
+        <w:pStyle w:val="Reference"/>
+      </w:pPr>
+      <w:r>
+        <w:t xml:space="preserve">Wang, J. T., and Jia, R. 2023. "Data Banzhaf: A Robust Data Valuation Framework for Machine Learning," in </w:t>
       </w:r>
       <w:r>
         <w:rPr>
           <w:i/>
         </w:rPr>
-        <w:t xml:space="preserve">Proceedings of the IEEE Symposium on Security and Privacy</w:t>
-      </w:r>
-      <w:r>
-        <w:t xml:space="preserve">.</w:t>
-      </w:r>
-    </w:p>
-    <w:p>
-      <w:pPr>
-        <w:pStyle w:val="Reference"/>
-      </w:pPr>
-      <w:r>
-        <w:t xml:space="preserve">Eldan, R., and Russinovich, M. 2023. "Who's Harry Potter? Approximate Unlearning in LLMs," </w:t>
-      </w:r>
-      <w:r>
-        <w:t xml:space="preserve">arXiv:2310.02238.</w:t>
-      </w:r>
-    </w:p>
-    <w:p>
-      <w:pPr>
-        <w:pStyle w:val="Reference"/>
-      </w:pPr>
-      <w:r>
-        <w:t xml:space="preserve">Ghorbani, A., and Zou, J. 2019. "Data Shapley: Equitable Valuation of Data for Machine Learning," in </w:t>
-      </w:r>
-      <w:r>
-        <w:rPr>
-          <w:i/>
-        </w:rPr>
-        <w:t xml:space="preserve">Proceedings of the International Conference on Machine Learning (ICML)</w:t>
-      </w:r>
-      <w:r>
-        <w:t xml:space="preserve">.</w:t>
-      </w:r>
-    </w:p>
-    <w:p>
-      <w:pPr>
-        <w:pStyle w:val="Reference"/>
-      </w:pPr>
-      <w:r>
-        <w:t xml:space="preserve">Ginart, A., Guan, M., Valiant, G., and Zou, J. 2019. "Making AI Forget You: Data Deletion in Machine Learning," in </w:t>
-      </w:r>
-      <w:r>
-        <w:rPr>
-          <w:i/>
-        </w:rPr>
-        <w:t xml:space="preserve">Advances in Neural Information Processing Systems (NeurIPS)</w:t>
-      </w:r>
-      <w:r>
-        <w:t xml:space="preserve">.</w:t>
-      </w:r>
-    </w:p>
-    <w:p>
-      <w:pPr>
-        <w:pStyle w:val="Reference"/>
-      </w:pPr>
-      <w:r>
-        <w:t xml:space="preserve">Grosse, R., Bae, J., Anil, C., Elhage, N., Tamkin, A., Tajdini, A., Steiner, B., Li, D., Durmus, E., Perez, E., Hubinger, E., Lukošiūtė, K., Nguyen, K., Joseph, N., McCandlish, S., Kaplan, J., and Bowman, S. R. 2023. "Studying Large Language Model Generalization with Influence Functions," </w:t>
-      </w:r>
-      <w:r>
-        <w:t xml:space="preserve">arXiv:2308.03296.</w:t>
-      </w:r>
-    </w:p>
-    <w:p>
-      <w:pPr>
-        <w:pStyle w:val="Reference"/>
-      </w:pPr>
-      <w:r>
-        <w:t xml:space="preserve">Jia, R., Dao, D., Wang, B., Hubis, F. A., Hynes, N., Gürel, N. M., Li, B., Zhang, C., Song, D., and Spanos, C. J. 2019. "Towards Efficient Data Valuation Based on the Shapley Value," in </w:t>
-      </w:r>
-      <w:r>
-        <w:rPr>
-          <w:i/>
-        </w:rPr>
-        <w:t xml:space="preserve">Proceedings of the International Conference on Artificial Intelligence and Statistics (AISTATS)</w:t>
-      </w:r>
-      <w:r>
-        <w:t xml:space="preserve">.</w:t>
-      </w:r>
-    </w:p>
-    <w:p>
-      <w:pPr>
-        <w:pStyle w:val="Reference"/>
-      </w:pPr>
-      <w:r>
-        <w:t xml:space="preserve">Jones, C. I., and Tonetti, C. 2020. "Nonrivalry and the Economics of Data," </w:t>
-      </w:r>
-      <w:r>
-        <w:rPr>
-          <w:i/>
-        </w:rPr>
-        <w:t xml:space="preserve">American Economic Review</w:t>
-      </w:r>
-      <w:r>
-        <w:t xml:space="preserve"> (110:9), pp. 2819-2858.</w:t>
-      </w:r>
-    </w:p>
-    <w:p>
-      <w:pPr>
-        <w:pStyle w:val="Reference"/>
-      </w:pPr>
-      <w:r>
-        <w:t xml:space="preserve">Koh, P. W., and Liang, P. 2017. "Understanding Black-Box Predictions via Influence Functions," in </w:t>
-      </w:r>
-      <w:r>
-        <w:rPr>
-          <w:i/>
-        </w:rPr>
-        <w:t xml:space="preserve">Proceedings of the International Conference on Machine Learning (ICML)</w:t>
-      </w:r>
-      <w:r>
-        <w:t xml:space="preserve">.</w:t>
-      </w:r>
-    </w:p>
-    <w:p>
-      <w:pPr>
-        <w:pStyle w:val="Reference"/>
-      </w:pPr>
-      <w:r>
-        <w:t xml:space="preserve">Kwon, Y., and Zou, J. 2022. "Beta Shapley: A Unified and Noise-Reduced Data Valuation Framework for Machine Learning," in </w:t>
-      </w:r>
-      <w:r>
-        <w:rPr>
-          <w:i/>
-        </w:rPr>
-        <w:t xml:space="preserve">Proceedings of the International Conference on Artificial Intelligence and Statistics (AISTATS)</w:t>
-      </w:r>
-      <w:r>
-        <w:t xml:space="preserve">.</w:t>
-      </w:r>
-    </w:p>
-    <w:p>
-      <w:pPr>
-        <w:pStyle w:val="Reference"/>
-      </w:pPr>
-      <w:r>
-        <w:t xml:space="preserve">Li, N., Pan, A., Gopal, A., Yue, S., Berrios, D., Gatti, A., Li, J. D., Dombrowski, A.-K., Goel, S., Phan, L., Mukobi, G., Helm-Burger, N., Lababidi, R., Justen, L., Liu, A. B., Chen, M., Barrass, I., Zhang, O., Zhu, X., Tamirisa, R., Bharathi, B., Khoja, A., Zhao, Z., Herbert-Voss, A., Breuer, C. B., Marks, S., Patel, O., Zou, A., Mazeika, M., Wang, Z., Oswal, P., Lin, W., Hunt, A. A., Tienken-Harder, J., Shih, K. Y., Talley, K., Guan, J., Kaplan, R., Steneker, I., Campbell, D., Jokubaitis, B., Levinson, A., Wang, J., Qian, W., Karmakar, K. K., Basart, S., Fitz, S., Levine, M., Kumaraguru, P., Tupakula, U., Varadharajan, V., Wang, R., Shoshitaishvili, Y., Ba, J., Esvelt, K. M., Wang, A., and Hendrycks, D. 2024. "The WMDP Benchmark: Measuring and Reducing Malicious Use with Unlearning," in </w:t>
-      </w:r>
-      <w:r>
-        <w:rPr>
-          <w:i/>
-        </w:rPr>
-        <w:t xml:space="preserve">Proceedings of the International Conference on Machine Learning (ICML)</w:t>
-      </w:r>
-      <w:r>
-        <w:t xml:space="preserve">.</w:t>
-      </w:r>
-    </w:p>
-    <w:p>
-      <w:pPr>
-        <w:pStyle w:val="Reference"/>
-      </w:pPr>
-      <w:r>
-        <w:t xml:space="preserve">Łucki, J., Wei, B., Huang, Y., Henderson, P., Tramèr, F., and Rando, J. 2024. "An Adversarial Perspective on Machine Unlearning for AI Safety," </w:t>
-      </w:r>
-      <w:r>
-        <w:t xml:space="preserve">arXiv:2409.18025.</w:t>
-      </w:r>
-    </w:p>
-    <w:p>
-      <w:pPr>
-        <w:pStyle w:val="Reference"/>
-      </w:pPr>
-      <w:r>
-        <w:t xml:space="preserve">Lynch, A., Guo, P., Ewart, A., Casper, S., and Hadfield-Menell, D. 2024. "Eight Methods to Evaluate Robust Unlearning in LLMs," </w:t>
-      </w:r>
-      <w:r>
-        <w:t xml:space="preserve">arXiv:2402.16835.</w:t>
-      </w:r>
-    </w:p>
-    <w:p>
-      <w:pPr>
-        <w:pStyle w:val="Reference"/>
-      </w:pPr>
-      <w:r>
-        <w:t xml:space="preserve">Maini, P., Feng, Z., Schwarzschild, A., Lipton, Z. C., and Kolter, J. Z. 2024. "TOFU: A Task of Fictitious Unlearning for LLMs," </w:t>
-      </w:r>
-      <w:r>
-        <w:t xml:space="preserve">arXiv:2401.06121.</w:t>
-      </w:r>
-    </w:p>
-    <w:p>
-      <w:pPr>
-        <w:pStyle w:val="Reference"/>
-      </w:pPr>
-      <w:r>
-        <w:t xml:space="preserve">Pruthi, G., Liu, F., Kale, S., and Sundararajan, M. 2020. "Estimating Training Data Influence by Tracing Gradient Descent," in </w:t>
-      </w:r>
-      <w:r>
-        <w:rPr>
-          <w:i/>
-        </w:rPr>
-        <w:t xml:space="preserve">Advances in Neural Information Processing Systems (NeurIPS)</w:t>
-      </w:r>
-      <w:r>
-        <w:t xml:space="preserve">.</w:t>
-      </w:r>
-    </w:p>
-    <w:p>
-      <w:pPr>
-        <w:pStyle w:val="Reference"/>
-      </w:pPr>
-      <w:r>
-        <w:t xml:space="preserve">Roth, A. E. (ed.). 1988. </w:t>
-      </w:r>
-      <w:r>
-        <w:rPr>
-          <w:i/>
-        </w:rPr>
-        <w:t xml:space="preserve">The Shapley Value: Essays in Honor of Lloyd S. Shapley</w:t>
-      </w:r>
-      <w:r>
-        <w:t xml:space="preserve">, Cambridge, UK: Cambridge University Press.</w:t>
-      </w:r>
-    </w:p>
-    <w:p>
-      <w:pPr>
-        <w:pStyle w:val="Reference"/>
-      </w:pPr>
-      <w:r>
-        <w:t xml:space="preserve">Shapley, L. S. 1953. "A Value for n-Person Games," in </w:t>
-      </w:r>
-      <w:r>
-        <w:rPr>
-          <w:i/>
-        </w:rPr>
-        <w:t xml:space="preserve">Contributions to the Theory of Games II</w:t>
-      </w:r>
-      <w:r>
-        <w:t xml:space="preserve">, H. W. Kuhn and A. W. Tucker (eds.), Princeton, NJ: Princeton University Press, pp. 307-317.</w:t>
-      </w:r>
-    </w:p>
-    <w:p>
-      <w:pPr>
-        <w:pStyle w:val="Reference"/>
-      </w:pPr>
-      <w:r>
-        <w:t xml:space="preserve">Shi, W., Lee, J., Huang, Y., Malladi, S., Zhao, J., Holtzman, A., Liu, D., Zettlemoyer, L., Smith, N. A., and Zhang, C. 2024. "MUSE: Machine Unlearning Six-Way Evaluation for Language Models," </w:t>
-      </w:r>
-      <w:r>
-        <w:t xml:space="preserve">arXiv:2407.06460.</w:t>
-      </w:r>
-    </w:p>
-    <w:p>
-      <w:pPr>
-        <w:pStyle w:val="Reference"/>
-      </w:pPr>
-      <w:r>
-        <w:t xml:space="preserve">Wang, J. T., and Jia, R. 2023. "Data Banzhaf: A Robust Data Valuation Framework for Machine Learning," in </w:t>
-      </w:r>
-      <w:r>
-        <w:rPr>
-          <w:i/>
-        </w:rPr>
-        <w:t xml:space="preserve">Proceedings of the International Conference on Artificial Intelligence and Statistics (AISTATS)</w:t>
-      </w:r>
-      <w:r>
-        <w:t xml:space="preserve">.</w:t>
+        <w:t xml:space="preserve">Proceedings of the 26th International Conference on Artificial Intelligence and Statistics (AISTATS)</w:t>
+      </w:r>
+      <w:r>
+        <w:t xml:space="preserve">, PMLR 206, pp. 6388-6421.</w:t>
       </w:r>
     </w:p>
     <w:p>

</xml_diff>

<commit_message>
Remove WMDP citation and reference from both manuscript versions
Benchmarks sentence in Section 2 now names TOFU and MUSE only.

Co-Authored-By: Claude Sonnet 5.5 <noreply@anthropic.com>
Claude-Session: https://claude.ai/code/session_011RffuMUjsLZvDoxDjbpt5j
</commit_message>
<xml_diff>
--- a/pricing_forgetting/Pricing_Forgetting_MISQ_submission.docx
+++ b/pricing_forgetting/Pricing_Forgetting_MISQ_submission.docx
@@ -132,7 +132,7 @@
         <w:t xml:space="preserve">Machine unlearning.</w:t>
       </w:r>
       <w:r>
-        <w:t xml:space="preserve"> Early formulations defined unlearning as producing a model indistinguishable from one retrained without the forget set (Cao and Yang 2015; Ginart et al. 2019). Exact methods such as SISA (Bourtoule et al. 2021) achieve this by sharding the training process, so that only a fraction of the model must be retrained. For large language models, most methods are approximate: Eldan and Russinovich (2023) proposed fine-tuning toward generic substitutes for memorized content, and Zhang et al. (2024) introduced Negative Preference Optimization as a more stable alternative to gradient ascent. Evaluation has become a research area in its own right, with benchmarks such as TOFU (Maini et al. 2024), WMDP (Li et al. 2024), and MUSE (Shi et al. 2024). Several studies report that unlearned knowledge can be recovered through light fine-tuning or adversarial prompting (Lynch et al. 2024; Łucki et al. 2024). We take this finding as a premise and ask how it propagates into valuation.</w:t>
+        <w:t xml:space="preserve"> Early formulations defined unlearning as producing a model indistinguishable from one retrained without the forget set (Cao and Yang 2015; Ginart et al. 2019). Exact methods such as SISA (Bourtoule et al. 2021) achieve this by sharding the training process, so that only a fraction of the model must be retrained. For large language models, most methods are approximate: Eldan and Russinovich (2023) proposed fine-tuning toward generic substitutes for memorized content, and Zhang et al. (2024) introduced Negative Preference Optimization as a more stable alternative to gradient ascent. Evaluation has become a research area in its own right, with benchmarks such as TOFU (Maini et al. 2024) and MUSE (Shi et al. 2024). Several studies report that unlearned knowledge can be recovered through light fine-tuning or adversarial prompting (Lynch et al. 2024; Łucki et al. 2024). We take this finding as a premise and ask how it propagates into valuation.</w:t>
       </w:r>
     </w:p>
     <w:p>
@@ -2365,23 +2365,6 @@
       </w:r>
       <w:r>
         <w:t xml:space="preserve">, PMLR 151, pp. 8780-8802.</w:t>
-      </w:r>
-    </w:p>
-    <w:p>
-      <w:pPr>
-        <w:pStyle w:val="Reference"/>
-      </w:pPr>
-      <w:r>
-        <w:t xml:space="preserve">Li, N., Pan, A., Gopal, A., Yue, S., Berrios, D., Gatti, A., Li, J. D., Dombrowski, A.-K., Goel, S., Mukobi, G., Helm-Burger, N., Lababidi, R., Justen, L., Liu, A. B., Chen, M., Barrass, I., Zhang, O., Zhu, X., Tamirisa, R., Bharathi, B., Herbert-Voss, A., Breuer, C. B., Zou, A., Mazeika, M., Wang, Z., Oswal, P., Lin, W., Hunt, A. A., Tienken-Harder, J., Shih, K. Y., Talley, K., Guan, J., Steneker, I., Campbell, D., Jokubaitis, B., Basart, S., Fitz, S., Kumaraguru, P., Karmakar, K. K., Tupakula, U., Varadharajan, V., Shoshitaishvili, Y., Ba, J., Esvelt, K. M., Wang, A., and Hendrycks, D. 2024. "The WMDP Benchmark: Measuring and Reducing Malicious Use with Unlearning," in </w:t>
-      </w:r>
-      <w:r>
-        <w:rPr>
-          <w:i/>
-        </w:rPr>
-        <w:t xml:space="preserve">Proceedings of the 41st International Conference on Machine Learning (ICML)</w:t>
-      </w:r>
-      <w:r>
-        <w:t xml:space="preserve">, PMLR 235, pp. 28525-28550.</w:t>
       </w:r>
     </w:p>
     <w:p>

</xml_diff>

<commit_message>
Remove Grosse et al. (2023) citation and reference from both versions
Co-Authored-By: Claude Sonnet 5.5 <noreply@anthropic.com>
Claude-Session: https://claude.ai/code/session_011RffuMUjsLZvDoxDjbpt5j
</commit_message>
<xml_diff>
--- a/pricing_forgetting/Pricing_Forgetting_MISQ_submission.docx
+++ b/pricing_forgetting/Pricing_Forgetting_MISQ_submission.docx
@@ -120,7 +120,7 @@
         <w:t xml:space="preserve">Data valuation.</w:t>
       </w:r>
       <w:r>
-        <w:t xml:space="preserve"> The use of the Shapley value (Shapley 1953) to value training data was introduced by Ghorbani and Zou (2019) and, independently, by Jia et al. (2019), who also proposed efficient approximations for specific model classes. Later work relaxed the efficiency axiom to obtain semivalues with better statistical properties, notably Beta Shapley (Kwon and Zou 2022) and Data Banzhaf (Wang and Jia 2023). Because exact Shapley computation requires retraining on exponentially many subsets, a separate line of work approximates marginal contributions with gradient-based influence estimates (Koh and Liang 2017; Pruthi et al. 2020), and Grosse et al. (2023) scaled influence functions to models with tens of billions of parameters. We take these estimators as given and ask what happens when the counterfactual they rely on is generated by unlearning rather than by retraining.</w:t>
+        <w:t xml:space="preserve"> The use of the Shapley value (Shapley 1953) to value training data was introduced by Ghorbani and Zou (2019) and, independently, by Jia et al. (2019), who also proposed efficient approximations for specific model classes. Later work relaxed the efficiency axiom to obtain semivalues with better statistical properties, notably Beta Shapley (Kwon and Zou 2022) and Data Banzhaf (Wang and Jia 2023). Because exact Shapley computation requires retraining on exponentially many subsets, a separate line of work approximates marginal contributions with gradient-based influence estimates (Koh and Liang 2017; Pruthi et al. 2020). We take these estimators as given and ask what happens when the counterfactual they rely on is generated by unlearning rather than by retraining.</w:t>
       </w:r>
     </w:p>
     <w:p>
@@ -2286,17 +2286,6 @@
       </w:r>
       <w:r>
         <w:t xml:space="preserve">, pp. 3518-3531.</w:t>
-      </w:r>
-    </w:p>
-    <w:p>
-      <w:pPr>
-        <w:pStyle w:val="Reference"/>
-      </w:pPr>
-      <w:r>
-        <w:t xml:space="preserve">Grosse, R., Bae, J., Anil, C., Elhage, N., Tamkin, A., Tajdini, A., Steiner, B., Li, D., Durmus, E., Perez, E., Hubinger, E., Lukošiūtė, K., Nguyen, K., Joseph, N., McCandlish, S., Kaplan, J., and Bowman, S. R. 2023. "Studying Large Language Model Generalization with Influence Functions," </w:t>
-      </w:r>
-      <w:r>
-        <w:t xml:space="preserve">arXiv:2308.03296.</w:t>
       </w:r>
     </w:p>
     <w:p>

</xml_diff>